<commit_message>
fix: reduce clinical document repetition
</commit_message>
<xml_diff>
--- a/assets/client-templates/docx/sterling-icf.template.docx
+++ b/assets/client-templates/docx/sterling-icf.template.docx
@@ -616,7 +616,7 @@
           <w:rFonts w:ascii="Arial" w:hAnsi="Arial"/>
           <w:sz w:val="22"/>
         </w:rPr>
-        <w:t>{AI_studyPurpose}</w:t>
+        <w:t>{AI_keyPurpose}</w:t>
       </w:r>
     </w:p>
     <w:p>
@@ -637,7 +637,7 @@
           <w:rFonts w:ascii="Arial" w:hAnsi="Arial"/>
           <w:sz w:val="22"/>
         </w:rPr>
-        <w:t>{AI_icfVisitsOverview} {AI_visitsAndLength}</w:t>
+        <w:t>{AI_keyParticipation}</w:t>
       </w:r>
     </w:p>
     <w:p>
@@ -658,7 +658,7 @@
           <w:rFonts w:ascii="Arial" w:hAnsi="Arial"/>
           <w:sz w:val="22"/>
         </w:rPr>
-        <w:t>{AI_interventionPossibleSideEffects}</w:t>
+        <w:t>{AI_keyRisks}</w:t>
       </w:r>
     </w:p>
     <w:p>
@@ -679,7 +679,7 @@
           <w:rFonts w:ascii="Arial" w:hAnsi="Arial"/>
           <w:sz w:val="22"/>
         </w:rPr>
-        <w:t>{AI_benefits}</w:t>
+        <w:t>{AI_keyBenefits}</w:t>
       </w:r>
     </w:p>
     <w:p>
@@ -700,7 +700,7 @@
           <w:rFonts w:ascii="Arial" w:hAnsi="Arial"/>
           <w:sz w:val="22"/>
         </w:rPr>
-        <w:t>{AI_alternatives}</w:t>
+        <w:t>{AI_keyAlternatives}</w:t>
       </w:r>
     </w:p>
     <w:p>

</xml_diff>